<commit_message>
update on title of netword design documentation
</commit_message>
<xml_diff>
--- a/Campus-network design/network design documentation.docx
+++ b/Campus-network design/network design documentation.docx
@@ -10,8 +10,82 @@
         <w:rPr>
           <w:b/>
           <w:bCs/>
-        </w:rPr>
-      </w:pPr>
+          <w:sz w:val="36"/>
+          <w:szCs w:val="36"/>
+        </w:rPr>
+      </w:pPr>
+      <w:r>
+        <w:rPr>
+          <w:b/>
+          <w:bCs/>
+        </w:rPr>
+        <w:t xml:space="preserve">                         </w:t>
+      </w:r>
+      <w:r>
+        <w:rPr>
+          <w:b/>
+          <w:bCs/>
+          <w:sz w:val="36"/>
+          <w:szCs w:val="36"/>
+        </w:rPr>
+        <w:t xml:space="preserve">NETWORK DESIGN PROJECT </w:t>
+      </w:r>
+    </w:p>
+    <w:p>
+      <w:pPr>
+        <w:tabs>
+          <w:tab w:val="left" w:pos="1257"/>
+        </w:tabs>
+        <w:rPr>
+          <w:b/>
+          <w:bCs/>
+          <w:sz w:val="28"/>
+          <w:szCs w:val="28"/>
+        </w:rPr>
+      </w:pPr>
+      <w:r>
+        <w:rPr>
+          <w:b/>
+          <w:bCs/>
+          <w:sz w:val="28"/>
+          <w:szCs w:val="28"/>
+        </w:rPr>
+        <w:t xml:space="preserve">                </w:t>
+      </w:r>
+      <w:r>
+        <w:rPr>
+          <w:b/>
+          <w:bCs/>
+          <w:sz w:val="28"/>
+          <w:szCs w:val="28"/>
+        </w:rPr>
+        <w:t>EXISTING NETWORK ENHANCEMENT</w:t>
+      </w:r>
+    </w:p>
+    <w:p>
+      <w:pPr>
+        <w:tabs>
+          <w:tab w:val="left" w:pos="1257"/>
+        </w:tabs>
+        <w:rPr>
+          <w:b/>
+          <w:bCs/>
+        </w:rPr>
+      </w:pPr>
+      <w:r>
+        <w:rPr>
+          <w:b/>
+          <w:bCs/>
+        </w:rPr>
+        <w:t xml:space="preserve">                 </w:t>
+      </w:r>
+      <w:r>
+        <w:rPr>
+          <w:b/>
+          <w:bCs/>
+        </w:rPr>
+        <w:br/>
+      </w:r>
       <w:r>
         <w:rPr>
           <w:b/>
@@ -255,6 +329,7 @@
         </w:tabs>
       </w:pPr>
       <w:r>
+        <w:lastRenderedPageBreak/>
         <w:t>The project focuses on one selected building (Lab Building) among the more than twenty buildings connected within the Hawassa University Main Campus network.</w:t>
       </w:r>
     </w:p>
@@ -264,39 +339,33 @@
           <w:tab w:val="left" w:pos="1257"/>
         </w:tabs>
       </w:pPr>
-      <w:r>
-        <w:pict w14:anchorId="06D7E951">
-          <v:rect id="_x0000_i1061" style="width:0;height:1.5pt" o:hralign="center" o:hrstd="t" o:hr="t" fillcolor="#a0a0a0" stroked="f"/>
-        </w:pict>
-      </w:r>
-    </w:p>
-    <w:p>
-      <w:pPr>
-        <w:tabs>
-          <w:tab w:val="left" w:pos="1257"/>
-        </w:tabs>
-        <w:rPr>
-          <w:b/>
-          <w:bCs/>
-        </w:rPr>
-      </w:pPr>
-    </w:p>
-    <w:p>
-      <w:pPr>
-        <w:tabs>
-          <w:tab w:val="left" w:pos="1257"/>
-        </w:tabs>
-        <w:rPr>
-          <w:b/>
-          <w:bCs/>
-        </w:rPr>
-      </w:pPr>
-      <w:r>
-        <w:rPr>
-          <w:b/>
-          <w:bCs/>
-        </w:rPr>
-        <w:lastRenderedPageBreak/>
+    </w:p>
+    <w:p>
+      <w:pPr>
+        <w:tabs>
+          <w:tab w:val="left" w:pos="1257"/>
+        </w:tabs>
+        <w:rPr>
+          <w:b/>
+          <w:bCs/>
+        </w:rPr>
+      </w:pPr>
+    </w:p>
+    <w:p>
+      <w:pPr>
+        <w:tabs>
+          <w:tab w:val="left" w:pos="1257"/>
+        </w:tabs>
+        <w:rPr>
+          <w:b/>
+          <w:bCs/>
+        </w:rPr>
+      </w:pPr>
+      <w:r>
+        <w:rPr>
+          <w:b/>
+          <w:bCs/>
+        </w:rPr>
         <w:t>2. Existing Network Assessment</w:t>
       </w:r>
     </w:p>
@@ -572,6 +641,7 @@
         </w:tabs>
       </w:pPr>
       <w:r>
+        <w:lastRenderedPageBreak/>
         <w:t xml:space="preserve">UTP cabling within buildings </w:t>
       </w:r>
     </w:p>
@@ -629,7 +699,6 @@
           <w:b/>
           <w:bCs/>
         </w:rPr>
-        <w:lastRenderedPageBreak/>
         <w:t>2.4 Network Devices</w:t>
       </w:r>
     </w:p>
@@ -884,6 +953,7 @@
           <w:b/>
           <w:bCs/>
         </w:rPr>
+        <w:lastRenderedPageBreak/>
         <w:t>2.8 Network Security Assessment</w:t>
       </w:r>
     </w:p>
@@ -936,7 +1006,6 @@
         </w:tabs>
       </w:pPr>
       <w:r>
-        <w:lastRenderedPageBreak/>
         <w:t xml:space="preserve">Physical security controls </w:t>
       </w:r>
     </w:p>
@@ -1040,11 +1109,6 @@
           <w:tab w:val="left" w:pos="1257"/>
         </w:tabs>
       </w:pPr>
-      <w:r>
-        <w:pict w14:anchorId="241E7802">
-          <v:rect id="_x0000_i1062" style="width:0;height:1.5pt" o:hralign="center" o:hrstd="t" o:hr="t" fillcolor="#a0a0a0" stroked="f"/>
-        </w:pict>
-      </w:r>
     </w:p>
     <w:p>
       <w:pPr>
@@ -1164,6 +1228,7 @@
         <w:rPr>
           <w:noProof/>
         </w:rPr>
+        <w:lastRenderedPageBreak/>
         <w:drawing>
           <wp:inline distT="0" distB="0" distL="0" distR="0" wp14:anchorId="1ABE9E51" wp14:editId="446EC246">
             <wp:extent cx="6350000" cy="2285365"/>
@@ -1218,7 +1283,6 @@
           <w:b/>
           <w:bCs/>
         </w:rPr>
-        <w:lastRenderedPageBreak/>
         <w:t>3.2 First Floor</w:t>
       </w:r>
     </w:p>
@@ -1457,6 +1521,7 @@
         <w:rPr>
           <w:noProof/>
         </w:rPr>
+        <w:lastRenderedPageBreak/>
         <w:drawing>
           <wp:inline distT="0" distB="0" distL="0" distR="0" wp14:anchorId="7391E1C1" wp14:editId="220633AD">
             <wp:extent cx="5347298" cy="4535798"/>
@@ -1570,7 +1635,6 @@
                 <w:b/>
                 <w:bCs/>
               </w:rPr>
-              <w:lastRenderedPageBreak/>
               <w:t>Room</w:t>
             </w:r>
           </w:p>
@@ -1773,6 +1837,7 @@
           <w:bCs/>
           <w:noProof/>
         </w:rPr>
+        <w:lastRenderedPageBreak/>
         <w:drawing>
           <wp:inline distT="0" distB="0" distL="0" distR="0" wp14:anchorId="02037708" wp14:editId="68242DB0">
             <wp:extent cx="5095240" cy="4210909"/>
@@ -1972,7 +2037,6 @@
               </w:tabs>
             </w:pPr>
             <w:r>
-              <w:lastRenderedPageBreak/>
               <w:t>Lab 7</w:t>
             </w:r>
           </w:p>
@@ -2070,6 +2134,7 @@
         <w:rPr>
           <w:noProof/>
         </w:rPr>
+        <w:lastRenderedPageBreak/>
         <w:drawing>
           <wp:inline distT="0" distB="0" distL="0" distR="0" wp14:anchorId="78DB430D" wp14:editId="31061821">
             <wp:extent cx="5385925" cy="3801110"/>
@@ -2431,11 +2496,6 @@
           <w:tab w:val="left" w:pos="1257"/>
         </w:tabs>
       </w:pPr>
-      <w:r>
-        <w:pict w14:anchorId="4148DDEE">
-          <v:rect id="_x0000_i1064" style="width:0;height:1.5pt" o:hralign="center" o:hrstd="t" o:hr="t" fillcolor="#a0a0a0" stroked="f"/>
-        </w:pict>
-      </w:r>
     </w:p>
     <w:p>
       <w:pPr>
@@ -2940,7 +3000,7 @@
       </w:pPr>
       <w:r>
         <w:pict w14:anchorId="2376D492">
-          <v:rect id="_x0000_i1065" style="width:0;height:1.5pt" o:hralign="center" o:hrstd="t" o:hr="t" fillcolor="#a0a0a0" stroked="f"/>
+          <v:rect id="_x0000_i1028" style="width:0;height:1.5pt" o:hralign="center" o:hrstd="t" o:hr="t" fillcolor="#a0a0a0" stroked="f"/>
         </w:pict>
       </w:r>
     </w:p>
@@ -3190,7 +3250,7 @@
       </w:pPr>
       <w:r>
         <w:pict w14:anchorId="20C5A81A">
-          <v:rect id="_x0000_i1066" style="width:0;height:1.5pt" o:hralign="center" o:hrstd="t" o:hr="t" fillcolor="#a0a0a0" stroked="f"/>
+          <v:rect id="_x0000_i1029" style="width:0;height:1.5pt" o:hralign="center" o:hrstd="t" o:hr="t" fillcolor="#a0a0a0" stroked="f"/>
         </w:pict>
       </w:r>
     </w:p>
@@ -7505,6 +7565,7 @@
   <w:style w:type="character" w:default="1" w:styleId="DefaultParagraphFont">
     <w:name w:val="Default Paragraph Font"/>
     <w:uiPriority w:val="1"/>
+    <w:semiHidden/>
     <w:unhideWhenUsed/>
   </w:style>
   <w:style w:type="table" w:default="1" w:styleId="TableNormal">

</xml_diff>